<commit_message>
Reword idea bank in plain speak
</commit_message>
<xml_diff>
--- a/Parallax-Idea-Bank.docx
+++ b/Parallax-Idea-Bank.docx
@@ -9,7 +9,7 @@
           <w:color w:val="1D1913"/>
           <w:sz w:val="44"/>
         </w:rPr>
-        <w:t>PARALLAX — Master Idea Bank</w:t>
+        <w:t>PARALLAX — Idea Bank</w:t>
       </w:r>
     </w:p>
     <w:p>
@@ -19,7 +19,7 @@
           <w:color w:val="6B6253"/>
           <w:sz w:val="22"/>
         </w:rPr>
-        <w:t>Everything parked, consolidated. Retirement-planning simulator for advisors.</w:t>
+        <w:t>Everything we've parked, in plain language. One line per idea.</w:t>
       </w:r>
     </w:p>
     <w:p>
@@ -28,7 +28,7 @@
           <w:color w:val="9A8F7C"/>
           <w:sz w:val="17"/>
         </w:rPr>
-        <w:t>Generated 2026-06-03 · sources: ROADMAP.md + NOTES.md + CLAUDE.md · tags: NEXT · BIG (own session) · PARKED · SKIP · done</w:t>
+        <w:t>Updated 2026-06-03 · tags: BIG = its own session · NEXT = build soon · MOCK = waiting your OK</w:t>
       </w:r>
     </w:p>
     <w:p/>
@@ -42,17 +42,7 @@
           <w:color w:val="B07D34"/>
           <w:sz w:val="28"/>
         </w:rPr>
-        <w:t>1 · Engine — material gaps  (truth source)</w:t>
-      </w:r>
-    </w:p>
-    <w:p>
-      <w:r>
-        <w:rPr>
-          <w:i/>
-          <w:color w:val="6B6253"/>
-          <w:sz w:val="19"/>
-        </w:rPr>
-        <w:t>The single truth source. The UI never adds math — only views/levers of what the engine emits.</w:t>
+        <w:t>1 · Math the engine can't do yet</w:t>
       </w:r>
     </w:p>
     <w:p>
@@ -65,14 +55,14 @@
           <w:color w:val="1D1913"/>
           <w:sz w:val="21"/>
         </w:rPr>
-        <w:t>Real assets in engine</w:t>
+        <w:t>Own your home &amp; property</w:t>
       </w:r>
       <w:r>
         <w:rPr>
           <w:color w:val="332F29"/>
           <w:sz w:val="21"/>
         </w:rPr>
-        <w:t xml:space="preserve"> — homes / property / business → “sell X to fund Y.”</w:t>
+        <w:t xml:space="preserve"> — model the house/business so you can show “sell this to pay for that.”</w:t>
       </w:r>
       <w:r>
         <w:rPr>
@@ -93,14 +83,14 @@
           <w:color w:val="1D1913"/>
           <w:sz w:val="21"/>
         </w:rPr>
-        <w:t>Tax-planning engine</w:t>
+        <w:t>Tax planning</w:t>
       </w:r>
       <w:r>
         <w:rPr>
           <w:color w:val="332F29"/>
           <w:sz w:val="21"/>
         </w:rPr>
-        <w:t xml:space="preserve"> — Roth conversions, bracket management, IRMAA, RMDs, contribution-side deduction. Its own engine.</w:t>
+        <w:t xml:space="preserve"> — Roth conversions, tax brackets, IRMAA, required withdrawals. A whole separate engine.</w:t>
       </w:r>
       <w:r>
         <w:rPr>
@@ -121,14 +111,14 @@
           <w:color w:val="1D1913"/>
           <w:sz w:val="21"/>
         </w:rPr>
-        <w:t>Survivor SS benefits</w:t>
+        <w:t>Survivor Social Security</w:t>
       </w:r>
       <w:r>
         <w:rPr>
           <w:color w:val="332F29"/>
           <w:sz w:val="21"/>
         </w:rPr>
-        <w:t xml:space="preserve"> — widow step-up (~100% of deceased's); major couples lever, unmodeled.</w:t>
+        <w:t xml:space="preserve"> — when one spouse dies, the other keeps the bigger check. Big for couples; not modeled.</w:t>
       </w:r>
     </w:p>
     <w:p>
@@ -141,14 +131,14 @@
           <w:color w:val="1D1913"/>
           <w:sz w:val="21"/>
         </w:rPr>
-        <w:t>Healthcare scales independently of lifestyle</w:t>
+        <w:t>Separate healthcare from lifestyle</w:t>
       </w:r>
       <w:r>
         <w:rPr>
           <w:color w:val="332F29"/>
           <w:sz w:val="21"/>
         </w:rPr>
-        <w:t xml:space="preserve"> — spendMult currently scales medical too; skews Solve-For.</w:t>
+        <w:t xml:space="preserve"> — today, cutting spending also cuts medical — which isn't real.</w:t>
       </w:r>
     </w:p>
     <w:p>
@@ -161,14 +151,14 @@
           <w:color w:val="1D1913"/>
           <w:sz w:val="21"/>
         </w:rPr>
-        <w:t>LTC cost escalation</w:t>
+        <w:t>Care costs that climb</w:t>
       </w:r>
       <w:r>
         <w:rPr>
           <w:color w:val="332F29"/>
           <w:sz w:val="21"/>
         </w:rPr>
-        <w:t xml:space="preserve"> — ~3–5%/yr above CPI; currently flat real.</w:t>
+        <w:t xml:space="preserve"> — long-term care rises faster than normal inflation; today it's flat.</w:t>
       </w:r>
     </w:p>
     <w:p>
@@ -181,14 +171,14 @@
           <w:color w:val="1D1913"/>
           <w:sz w:val="21"/>
         </w:rPr>
-        <w:t>One-time inflow support</w:t>
+        <w:t>Money coming IN once</w:t>
       </w:r>
       <w:r>
         <w:rPr>
           <w:color w:val="332F29"/>
           <w:sz w:val="21"/>
         </w:rPr>
-        <w:t xml:space="preserve"> — relocation / downsizing; current lumpSum is outflow-only.</w:t>
+        <w:t xml:space="preserve"> — downsizing or a sale adds cash; today the tool only handles money going out.</w:t>
       </w:r>
     </w:p>
     <w:p>
@@ -201,14 +191,37 @@
           <w:color w:val="1D1913"/>
           <w:sz w:val="21"/>
         </w:rPr>
-        <w:t>Map the other engines</w:t>
+        <w:t>Plan the other engines</w:t>
       </w:r>
       <w:r>
         <w:rPr>
           <w:color w:val="332F29"/>
           <w:sz w:val="21"/>
         </w:rPr>
-        <w:t xml:space="preserve"> — tax, estate… before building piecemeal.</w:t>
+        <w:t xml:space="preserve"> — tax, estate — sketch them before building piece by piece.</w:t>
+      </w:r>
+    </w:p>
+    <w:p>
+      <w:pPr>
+        <w:pStyle w:val="Heading1"/>
+      </w:pPr>
+      <w:r>
+        <w:rPr>
+          <w:b/>
+          <w:color w:val="B07D34"/>
+          <w:sz w:val="28"/>
+        </w:rPr>
+        <w:t>2 · What makes Parallax different</w:t>
+      </w:r>
+    </w:p>
+    <w:p>
+      <w:r>
+        <w:rPr>
+          <w:i/>
+          <w:color w:val="6B6253"/>
+          <w:sz w:val="19"/>
+        </w:rPr>
+        <w:t>Most tools just move sliders and watch a number. This is the part competitors can't copy.</w:t>
       </w:r>
     </w:p>
     <w:p>
@@ -221,14 +234,62 @@
           <w:color w:val="1D1913"/>
           <w:sz w:val="21"/>
         </w:rPr>
-        <w:t>Cleanup</w:t>
+        <w:t>Answer the client's question</w:t>
       </w:r>
       <w:r>
         <w:rPr>
           <w:color w:val="332F29"/>
           <w:sz w:val="21"/>
         </w:rPr>
-        <w:t xml:space="preserve"> — ASSET_STATS[k].mean computed but unused — deletable.</w:t>
+        <w:t xml:space="preserve"> — instead of guessing, they ask “Can I retire earlier?” and the tool finds the answer and drops it in as a new column.</w:t>
+      </w:r>
+      <w:r>
+        <w:rPr>
+          <w:b/>
+          <w:color w:val="8A7C61"/>
+          <w:sz w:val="16"/>
+        </w:rPr>
+        <w:t xml:space="preserve">  [NEXT]</w:t>
+      </w:r>
+    </w:p>
+    <w:p>
+      <w:pPr>
+        <w:pStyle w:val="ListBullet"/>
+      </w:pPr>
+      <w:r>
+        <w:rPr>
+          <w:b/>
+          <w:color w:val="1D1913"/>
+          <w:sz w:val="21"/>
+        </w:rPr>
+        <w:t>Show the realistic combos</w:t>
+      </w:r>
+      <w:r>
+        <w:rPr>
+          <w:color w:val="332F29"/>
+          <w:sz w:val="21"/>
+        </w:rPr>
+        <w:t xml:space="preserve"> — when one change isn't enough: “retire at 62 if you spend $850/mo less, OR save more and claim SS later.”</w:t>
+      </w:r>
+    </w:p>
+    <w:p>
+      <w:pPr>
+        <w:pStyle w:val="ListBullet"/>
+      </w:pPr>
+      <w:r>
+        <w:rPr>
+          <w:b/>
+          <w:color w:val="1D1913"/>
+          <w:sz w:val="21"/>
+        </w:rPr>
+        <w:t>The decision map</w:t>
+      </w:r>
+      <w:r>
+        <w:rPr>
+          <w:color w:val="332F29"/>
+          <w:sz w:val="21"/>
+        </w:rPr>
+        <w:t xml:space="preserve"> — one picture of every retirement-age × spending combo, colored by confidence. Click a spot to make it a scenario.</w:t>
       </w:r>
     </w:p>
     <w:p>
@@ -241,17 +302,7 @@
           <w:color w:val="B07D34"/>
           <w:sz w:val="28"/>
         </w:rPr>
-        <w:t>2 · Core differentiators — the moat  (BIG)</w:t>
-      </w:r>
-    </w:p>
-    <w:p>
-      <w:r>
-        <w:rPr>
-          <w:i/>
-          <w:color w:val="6B6253"/>
-          <w:sz w:val="19"/>
-        </w:rPr>
-        <w:t>The defensible layer: deterministic, explainable, multi-variable decision-solving — not “Monte Carlo + sliders.”</w:t>
+        <w:t>3 · Easy wins — just show what's already in the numbers</w:t>
       </w:r>
     </w:p>
     <w:p>
@@ -264,22 +315,14 @@
           <w:color w:val="1D1913"/>
           <w:sz w:val="21"/>
         </w:rPr>
-        <w:t>Solve-For mode</w:t>
+        <w:t>Why it fails</w:t>
       </w:r>
       <w:r>
         <w:rPr>
           <w:color w:val="332F29"/>
           <w:sz w:val="21"/>
         </w:rPr>
-        <w:t xml:space="preserve"> — named life questions: ① “Can I retire earlier?” (build first) ② “Can we afford this big goal?” ③ (later) “Spend more?” On-demand (one engine job/click); output = a new scenario column; exactly one free lever.</w:t>
-      </w:r>
-      <w:r>
-        <w:rPr>
-          <w:b/>
-          <w:color w:val="8A7C61"/>
-          <w:sz w:val="16"/>
-        </w:rPr>
-        <w:t xml:space="preserve">  [NEXT-ish]</w:t>
+        <w:t xml:space="preserve"> — click the % and see when the money runs out and which years are tightest.</w:t>
       </w:r>
     </w:p>
     <w:p>
@@ -292,14 +335,14 @@
           <w:color w:val="1D1913"/>
           <w:sz w:val="21"/>
         </w:rPr>
-        <w:t>Explainable constraint solver</w:t>
+        <w:t>Meeting summary</w:t>
       </w:r>
       <w:r>
         <w:rPr>
           <w:color w:val="332F29"/>
           <w:sz w:val="21"/>
         </w:rPr>
-        <w:t xml:space="preserve"> — multi-variable search returning a small Pareto set of least-disruptive paths; auditable replay. Also fixes the solo-vs-combined display confusion.</w:t>
+        <w:t xml:space="preserve"> — a clean one-pager of what changed and what it did — the thing you hand the client.</w:t>
       </w:r>
     </w:p>
     <w:p>
@@ -312,14 +355,74 @@
           <w:color w:val="1D1913"/>
           <w:sz w:val="21"/>
         </w:rPr>
-        <w:t>Decision Surface heatmap</w:t>
+        <w:t>The danger years</w:t>
       </w:r>
       <w:r>
         <w:rPr>
           <w:color w:val="332F29"/>
           <w:sz w:val="21"/>
         </w:rPr>
-        <w:t xml:space="preserve"> — retire-age × spend, confidence contours, saved scenarios as clickable points. Best embodiment of “Parallax models interactions.” Alternate view in Scenarios.</w:t>
+        <w:t xml:space="preserve"> — the first 10 retirement years laid out, so you can see why retiring into 1973 or 2000 hurt.</w:t>
+      </w:r>
+    </w:p>
+    <w:p>
+      <w:pPr>
+        <w:pStyle w:val="ListBullet"/>
+      </w:pPr>
+      <w:r>
+        <w:rPr>
+          <w:b/>
+          <w:color w:val="1D1913"/>
+          <w:sz w:val="21"/>
+        </w:rPr>
+        <w:t>The gap before Social Security</w:t>
+      </w:r>
+      <w:r>
+        <w:rPr>
+          <w:color w:val="332F29"/>
+          <w:sz w:val="21"/>
+        </w:rPr>
+        <w:t xml:space="preserve"> — show the years the portfolio has to carry before SS/pension starts.</w:t>
+      </w:r>
+    </w:p>
+    <w:p>
+      <w:pPr>
+        <w:pStyle w:val="ListBullet"/>
+      </w:pPr>
+      <w:r>
+        <w:rPr>
+          <w:b/>
+          <w:color w:val="1D1913"/>
+          <w:sz w:val="21"/>
+        </w:rPr>
+        <w:t>Plain-English tiles</w:t>
+      </w:r>
+      <w:r>
+        <w:rPr>
+          <w:color w:val="332F29"/>
+          <w:sz w:val="21"/>
+        </w:rPr>
+        <w:t xml:space="preserve"> — “could retire at 58,” “safe to spend $X,” “14 years of cushion.”</w:t>
+      </w:r>
+    </w:p>
+    <w:p>
+      <w:pPr>
+        <w:pStyle w:val="ListBullet"/>
+      </w:pPr>
+      <w:r>
+        <w:rPr>
+          <w:b/>
+          <w:color w:val="1D1913"/>
+          <w:sz w:val="21"/>
+        </w:rPr>
+        <w:t>Year-by-year confidence</w:t>
+      </w:r>
+      <w:r>
+        <w:rPr>
+          <w:color w:val="332F29"/>
+          <w:sz w:val="21"/>
+        </w:rPr>
+        <w:t xml:space="preserve"> — green/yellow/red per year (only if it's real data).</w:t>
       </w:r>
     </w:p>
     <w:p>
@@ -332,17 +435,7 @@
           <w:color w:val="B07D34"/>
           <w:sz w:val="28"/>
         </w:rPr>
-        <w:t>3 · High-value views of existing truth  (low lift)</w:t>
-      </w:r>
-    </w:p>
-    <w:p>
-      <w:r>
-        <w:rPr>
-          <w:i/>
-          <w:color w:val="6B6253"/>
-          <w:sz w:val="19"/>
-        </w:rPr>
-        <w:t>Mostly a VIEW of data the sims already emit — no new math.</w:t>
+        <w:t>4 · Scenarios &amp; inputs</w:t>
       </w:r>
     </w:p>
     <w:p>
@@ -355,14 +448,22 @@
           <w:color w:val="1D1913"/>
           <w:sz w:val="21"/>
         </w:rPr>
-        <w:t>Failure Anatomy</w:t>
+        <w:t>Add-account picker</w:t>
       </w:r>
       <w:r>
         <w:rPr>
           <w:color w:val="332F29"/>
           <w:sz w:val="21"/>
         </w:rPr>
-        <w:t xml:space="preserve"> — click a % ring → depletion-age histogram, earliest pressure year, success/depleted split, one representative failed path in the cash-flow drawer. Best ROI.</w:t>
+        <w:t xml:space="preserve"> — 401k, IRA, Roth, etc. Built as a mock — waiting your OK to go live.</w:t>
+      </w:r>
+      <w:r>
+        <w:rPr>
+          <w:b/>
+          <w:color w:val="8A7C61"/>
+          <w:sz w:val="16"/>
+        </w:rPr>
+        <w:t xml:space="preserve">  [MOCK]</w:t>
       </w:r>
     </w:p>
     <w:p>
@@ -375,155 +476,14 @@
           <w:color w:val="1D1913"/>
           <w:sz w:val="21"/>
         </w:rPr>
-        <w:t>Scenario Receipt</w:t>
+        <w:t>Cleaner scenario layout</w:t>
       </w:r>
       <w:r>
         <w:rPr>
           <w:color w:val="332F29"/>
           <w:sz w:val="21"/>
         </w:rPr>
-        <w:t xml:space="preserve"> — per-scenario delta drawer (levers moved + confidence/median before→after + worst market). Meeting takeaway / export. Data, not prose.</w:t>
-      </w:r>
-    </w:p>
-    <w:p>
-      <w:pPr>
-        <w:pStyle w:val="ListBullet"/>
-      </w:pPr>
-      <w:r>
-        <w:rPr>
-          <w:b/>
-          <w:color w:val="1D1913"/>
-          <w:sz w:val="21"/>
-        </w:rPr>
-        <w:t>Sequence Pressure Strip</w:t>
-      </w:r>
-      <w:r>
-        <w:rPr>
-          <w:color w:val="332F29"/>
-          <w:sz w:val="21"/>
-        </w:rPr>
-        <w:t xml:space="preserve"> — first ~10 retirement years as cells (return / withdrawal / ending balance), cursor synced to chart + drawer. Explains why 1973 / 2000 hurt.</w:t>
-      </w:r>
-    </w:p>
-    <w:p>
-      <w:pPr>
-        <w:pStyle w:val="ListBullet"/>
-      </w:pPr>
-      <w:r>
-        <w:rPr>
-          <w:b/>
-          <w:color w:val="1D1913"/>
-          <w:sz w:val="21"/>
-        </w:rPr>
-        <w:t>Funding Bridge / bridge-years</w:t>
-      </w:r>
-      <w:r>
-        <w:rPr>
-          <w:color w:val="332F29"/>
-          <w:sz w:val="21"/>
-        </w:rPr>
-        <w:t xml:space="preserve"> — stacked age timeline of income layers; the pre-SS/pension gap.</w:t>
-      </w:r>
-    </w:p>
-    <w:p>
-      <w:pPr>
-        <w:pStyle w:val="ListBullet"/>
-      </w:pPr>
-      <w:r>
-        <w:rPr>
-          <w:b/>
-          <w:color w:val="1D1913"/>
-          <w:sz w:val="21"/>
-        </w:rPr>
-        <w:t>Honest derived tiles</w:t>
-      </w:r>
-      <w:r>
-        <w:rPr>
-          <w:color w:val="332F29"/>
-          <w:sz w:val="21"/>
-        </w:rPr>
-        <w:t xml:space="preserve"> — longevity buffer, max sustainable withdrawal %, “could retire at X.”</w:t>
-      </w:r>
-    </w:p>
-    <w:p>
-      <w:pPr>
-        <w:pStyle w:val="ListBullet"/>
-      </w:pPr>
-      <w:r>
-        <w:rPr>
-          <w:b/>
-          <w:color w:val="1D1913"/>
-          <w:sz w:val="21"/>
-        </w:rPr>
-        <w:t>Confidence-by-year bars</w:t>
-      </w:r>
-      <w:r>
-        <w:rPr>
-          <w:color w:val="332F29"/>
-          <w:sz w:val="21"/>
-        </w:rPr>
-        <w:t xml:space="preserve"> — + a single “Confidence Age” — only if it's real per-year data.</w:t>
-      </w:r>
-    </w:p>
-    <w:p>
-      <w:pPr>
-        <w:pStyle w:val="Heading1"/>
-      </w:pPr>
-      <w:r>
-        <w:rPr>
-          <w:b/>
-          <w:color w:val="B07D34"/>
-          <w:sz w:val="28"/>
-        </w:rPr>
-        <w:t>4 · Scenarios / input model</w:t>
-      </w:r>
-    </w:p>
-    <w:p>
-      <w:pPr>
-        <w:pStyle w:val="ListBullet"/>
-      </w:pPr>
-      <w:r>
-        <w:rPr>
-          <w:b/>
-          <w:color w:val="1D1913"/>
-          <w:sz w:val="21"/>
-        </w:rPr>
-        <w:t>Account-types picker</w:t>
-      </w:r>
-      <w:r>
-        <w:rPr>
-          <w:color w:val="332F29"/>
-          <w:sz w:val="21"/>
-        </w:rPr>
-        <w:t xml:space="preserve"> — “+ add investment account” with type picker (401k/403b/457/SEP/SIMPLE/solo-401k → pre-tax).</w:t>
-      </w:r>
-      <w:r>
-        <w:rPr>
-          <w:b/>
-          <w:color w:val="8A7C61"/>
-          <w:sz w:val="16"/>
-        </w:rPr>
-        <w:t xml:space="preserve">  [mock built, awaiting OK]</w:t>
-      </w:r>
-    </w:p>
-    <w:p>
-      <w:pPr>
-        <w:pStyle w:val="ListBullet"/>
-      </w:pPr>
-      <w:r>
-        <w:rPr>
-          <w:b/>
-          <w:color w:val="1D1913"/>
-          <w:sz w:val="21"/>
-        </w:rPr>
-        <w:t>Scenarios “shared-track” redesign</w:t>
-      </w:r>
-      <w:r>
-        <w:rPr>
-          <w:color w:val="332F29"/>
-          <w:sz w:val="21"/>
-        </w:rPr>
-        <w:t xml:space="preserve"> — kill the 3-column repetition; one shared track per lever, dots split only on divergence. Approved-in-spirit.</w:t>
+        <w:t xml:space="preserve"> — stop repeating three identical columns; show one value, split only where they differ.</w:t>
       </w:r>
       <w:r>
         <w:rPr>
@@ -544,14 +504,14 @@
           <w:color w:val="1D1913"/>
           <w:sz w:val="21"/>
         </w:rPr>
-        <w:t>Pension claim-age analysis</w:t>
+        <w:t>Pension timing</w:t>
       </w:r>
       <w:r>
         <w:rPr>
           <w:color w:val="332F29"/>
           <w:sz w:val="21"/>
         </w:rPr>
-        <w:t xml:space="preserve"> — sub-mode: claim-age sweep (62→70) + breakeven.</w:t>
+        <w:t xml:space="preserve"> — sweep claim ages 62→70 and show the break-even.</w:t>
       </w:r>
     </w:p>
     <w:p>
@@ -564,14 +524,14 @@
           <w:color w:val="1D1913"/>
           <w:sz w:val="21"/>
         </w:rPr>
-        <w:t>Real-assets input</w:t>
+        <w:t>Property input screen</w:t>
       </w:r>
       <w:r>
         <w:rPr>
           <w:color w:val="332F29"/>
           <w:sz w:val="21"/>
         </w:rPr>
-        <w:t xml:space="preserve"> — Money Pro balance-details layout (pairs with engine real-assets).</w:t>
+        <w:t xml:space="preserve"> — where you enter homes and other real assets.</w:t>
       </w:r>
     </w:p>
     <w:p>
@@ -584,14 +544,14 @@
           <w:color w:val="1D1913"/>
           <w:sz w:val="21"/>
         </w:rPr>
-        <w:t>“Duplicate scenario” action</w:t>
+        <w:t>Duplicate a scenario</w:t>
       </w:r>
       <w:r>
         <w:rPr>
           <w:color w:val="332F29"/>
           <w:sz w:val="21"/>
         </w:rPr>
-        <w:t xml:space="preserve"> — distinct from Add.</w:t>
+        <w:t xml:space="preserve"> — a copy button, separate from “Add.”</w:t>
       </w:r>
     </w:p>
     <w:p>
@@ -604,7 +564,7 @@
           <w:color w:val="B07D34"/>
           <w:sz w:val="28"/>
         </w:rPr>
-        <w:t>5 · Sequencing</w:t>
+        <w:t>5 · Sequencing — same plan, different markets</w:t>
       </w:r>
     </w:p>
     <w:p>
@@ -617,14 +577,14 @@
           <w:color w:val="1D1913"/>
           <w:sz w:val="21"/>
         </w:rPr>
-        <w:t>Strategy Fork on one path</w:t>
+        <w:t>Test moves against one bad market</w:t>
       </w:r>
       <w:r>
         <w:rPr>
           <w:color w:val="332F29"/>
           <w:sz w:val="21"/>
         </w:rPr>
-        <w:t xml:space="preserve"> — fix ONE market, compare strategies on it. Your #1 advisor function. Decide Scenarios-vs-Sequencing home first (overlap).</w:t>
+        <w:t xml:space="preserve"> — pick a tough year, then compare strategies on it. Your #1 use.</w:t>
       </w:r>
     </w:p>
     <w:p>
@@ -637,14 +597,14 @@
           <w:color w:val="1D1913"/>
           <w:sz w:val="21"/>
         </w:rPr>
-        <w:t>Recovery Tunnel</w:t>
+        <w:t>Years underwater</w:t>
       </w:r>
       <w:r>
         <w:rPr>
           <w:color w:val="332F29"/>
           <w:sz w:val="21"/>
         </w:rPr>
-        <w:t xml:space="preserve"> — full years-underwater valley view.</w:t>
+        <w:t xml:space="preserve"> — how long a plan stays below where it started — even when it survives.</w:t>
       </w:r>
     </w:p>
     <w:p>
@@ -657,14 +617,14 @@
           <w:color w:val="1D1913"/>
           <w:sz w:val="21"/>
         </w:rPr>
-        <w:t>Sequence Duration / damage-window labels</w:t>
+        <w:t>Name each crash</w:t>
       </w:r>
       <w:r>
         <w:rPr>
           <w:color w:val="332F29"/>
           <w:sz w:val="21"/>
         </w:rPr>
-        <w:t xml:space="preserve"> — “short shock” (’08–09, V-shaped) vs “long grind” (’66 / ’73). A label, not new math.</w:t>
+        <w:t xml:space="preserve"> — “short shock” (2008, bounces back) vs “long grind” (1966/1973, slow bleed).</w:t>
       </w:r>
     </w:p>
     <w:p>
@@ -677,7 +637,7 @@
           <w:color w:val="B07D34"/>
           <w:sz w:val="28"/>
         </w:rPr>
-        <w:t>6 · This session's adds  (2026-06-03)</w:t>
+        <w:t>6 · Added this session</w:t>
       </w:r>
     </w:p>
     <w:p>
@@ -690,14 +650,14 @@
           <w:color w:val="1D1913"/>
           <w:sz w:val="21"/>
         </w:rPr>
-        <w:t>Home sale event + cap-gains on sale</w:t>
+        <w:t>Sell-the-home event</w:t>
       </w:r>
       <w:r>
         <w:rPr>
           <w:color w:val="332F29"/>
           <w:sz w:val="21"/>
         </w:rPr>
-        <w:t xml:space="preserve"> — proceeds = value − mortgage − cap-gains tax; needs the $250k/$500k-MFJ primary-residence exclusion + a capitalImprovements basis field. purchasePrice already captured &amp; inert. Extends “real assets.”</w:t>
+        <w:t xml:space="preserve"> — when sold: price minus mortgage minus tax. Include the $250k/$500k home-sale tax break and improvements. (Purchase price already saved.)</w:t>
       </w:r>
     </w:p>
     <w:p>
@@ -710,14 +670,14 @@
           <w:color w:val="1D1913"/>
           <w:sz w:val="21"/>
         </w:rPr>
-        <w:t>taxClass on income streams</w:t>
+        <w:t>Tax type per income</w:t>
       </w:r>
       <w:r>
         <w:rPr>
           <w:color w:val="332F29"/>
           <w:sz w:val="21"/>
         </w:rPr>
-        <w:t xml:space="preserve"> — ordinary / tax-free / cap-gains; today all other income is flat ordinary. An engine field, not a label.</w:t>
+        <w:t xml:space="preserve"> — mark income taxable, tax-free, or capital-gains; today it's all taxed the same.</w:t>
       </w:r>
     </w:p>
     <w:p>
@@ -730,14 +690,14 @@
           <w:color w:val="1D1913"/>
           <w:sz w:val="21"/>
         </w:rPr>
-        <w:t>Sustainable-withdrawal solve</w:t>
+        <w:t>Safe-withdrawal solver</w:t>
       </w:r>
       <w:r>
         <w:rPr>
           <w:color w:val="332F29"/>
           <w:sz w:val="21"/>
         </w:rPr>
-        <w:t xml:space="preserve"> — back into a safe annual portfolio draw, framed as “sustainable withdrawal,” not income.</w:t>
+        <w:t xml:space="preserve"> — work out a sustainable yearly draw — and call it that, not “income.”</w:t>
       </w:r>
     </w:p>
     <w:p>
@@ -750,14 +710,14 @@
           <w:color w:val="1D1913"/>
           <w:sz w:val="21"/>
         </w:rPr>
-        <w:t>Income-stream COLA</w:t>
+        <w:t>Income that fades</w:t>
       </w:r>
       <w:r>
         <w:rPr>
           <w:color w:val="332F29"/>
           <w:sz w:val="21"/>
         </w:rPr>
-        <w:t xml:space="preserve"> — variable income is flat-real today; let fixed annuities erode.</w:t>
+        <w:t xml:space="preserve"> — let fixed annuities lose value to inflation like they really do.</w:t>
       </w:r>
     </w:p>
     <w:p>
@@ -770,14 +730,14 @@
           <w:color w:val="1D1913"/>
           <w:sz w:val="21"/>
         </w:rPr>
-        <w:t>Rolling-period analysis</w:t>
+        <w:t>Run every year of history</w:t>
       </w:r>
       <w:r>
         <w:rPr>
           <w:color w:val="332F29"/>
           <w:sz w:val="21"/>
         </w:rPr>
-        <w:t xml:space="preserve"> — extended block bootstrap — sweep every real contiguous historical window, not just the named Sequencing years.</w:t>
+        <w:t xml:space="preserve"> — test the plan against every real start year, not just a chosen few.</w:t>
       </w:r>
     </w:p>
     <w:p>
@@ -790,14 +750,14 @@
           <w:color w:val="1D1913"/>
           <w:sz w:val="21"/>
         </w:rPr>
-        <w:t>Goals page — interesting layout</w:t>
+        <w:t>Nicer Goals page</w:t>
       </w:r>
       <w:r>
         <w:rPr>
           <w:color w:val="332F29"/>
           <w:sz w:val="21"/>
         </w:rPr>
-        <w:t xml:space="preserve"> — not the ledger style. End-date windows already built; visual redesign pinned.</w:t>
+        <w:t xml:space="preserve"> — end-dates are done; the better-looking layout is pinned for later.</w:t>
       </w:r>
     </w:p>
     <w:p>
@@ -810,7 +770,7 @@
           <w:color w:val="B07D34"/>
           <w:sz w:val="28"/>
         </w:rPr>
-        <w:t>7 · Future surfaces / views</w:t>
+        <w:t>7 · Future screens</w:t>
       </w:r>
     </w:p>
     <w:p>
@@ -823,14 +783,14 @@
           <w:color w:val="1D1913"/>
           <w:sz w:val="21"/>
         </w:rPr>
-        <w:t>Comprehensive plan view (read-only)</w:t>
+        <w:t>Full plan view</w:t>
       </w:r>
       <w:r>
         <w:rPr>
           <w:color w:val="332F29"/>
           <w:sz w:val="21"/>
         </w:rPr>
-        <w:t xml:space="preserve"> — the whole plan as a presentation-grade client deliverable. Edits stay on input pages.</w:t>
+        <w:t xml:space="preserve"> — the whole plan on one clean page to hand the client (read-only).</w:t>
       </w:r>
     </w:p>
     <w:p>
@@ -843,14 +803,14 @@
           <w:color w:val="1D1913"/>
           <w:sz w:val="21"/>
         </w:rPr>
-        <w:t>Prospect-level view</w:t>
+        <w:t>Prospect view</w:t>
       </w:r>
       <w:r>
         <w:rPr>
           <w:color w:val="332F29"/>
           <w:sz w:val="21"/>
         </w:rPr>
-        <w:t xml:space="preserve"> — a lighter “quick illustration” tier for prospects/sales (a reduced view of the same engine).</w:t>
+        <w:t xml:space="preserve"> — a quick, light version to show value before building a full plan.</w:t>
       </w:r>
     </w:p>
     <w:p>
@@ -863,14 +823,14 @@
           <w:color w:val="1D1913"/>
           <w:sz w:val="21"/>
         </w:rPr>
-        <w:t>Investment comparisons</w:t>
+        <w:t>Investment comparison</w:t>
       </w:r>
       <w:r>
         <w:rPr>
           <w:color w:val="332F29"/>
           <w:sz w:val="21"/>
         </w:rPr>
-        <w:t xml:space="preserve"> — proposed-vs-current / efficient-frontier. ⚠ overlaps Scenarios — pin the distinct angle first.</w:t>
+        <w:t xml:space="preserve"> — proposed vs current. Careful — overlaps Scenarios; pin the angle first.</w:t>
       </w:r>
     </w:p>
     <w:p>
@@ -883,7 +843,7 @@
           <w:color w:val="B07D34"/>
           <w:sz w:val="28"/>
         </w:rPr>
-        <w:t>8 · Smaller wins / hygiene</w:t>
+        <w:t>8 · Small fixes &amp; cleanup</w:t>
       </w:r>
     </w:p>
     <w:p>
@@ -896,14 +856,14 @@
           <w:color w:val="1D1913"/>
           <w:sz w:val="21"/>
         </w:rPr>
-        <w:t>Rename “Net Worth” tab → “Plan” / “Household”</w:t>
+        <w:t>Rename “Net Worth” tab → “Plan”</w:t>
       </w:r>
       <w:r>
         <w:rPr>
           <w:color w:val="332F29"/>
           <w:sz w:val="21"/>
         </w:rPr>
-        <w:t xml:space="preserve"> — now holds cash flow / goals / snapshot. Quick win.</w:t>
+        <w:t xml:space="preserve"> — it holds more than net worth now.</w:t>
       </w:r>
     </w:p>
     <w:p>
@@ -916,14 +876,14 @@
           <w:color w:val="1D1913"/>
           <w:sz w:val="21"/>
         </w:rPr>
-        <w:t>Codify visual grammar</w:t>
+        <w:t>Write down the color rules</w:t>
       </w:r>
       <w:r>
         <w:rPr>
           <w:color w:val="332F29"/>
           <w:sz w:val="21"/>
         </w:rPr>
-        <w:t xml:space="preserve"> — dashed underline = editable; solid = result; brass = selected/caution; clay = pressure; teal = baseline. Write it down.</w:t>
+        <w:t xml:space="preserve"> — so the look stays consistent as it grows.</w:t>
       </w:r>
     </w:p>
     <w:p>
@@ -936,14 +896,14 @@
           <w:color w:val="1D1913"/>
           <w:sz w:val="21"/>
         </w:rPr>
-        <w:t>Assumption ledger</w:t>
+        <w:t>“Where did this number come from” tags</w:t>
       </w:r>
       <w:r>
         <w:rPr>
           <w:color w:val="332F29"/>
           <w:sz w:val="21"/>
         </w:rPr>
-        <w:t xml:space="preserve"> — Entered / Derived / Simulated / Historical tags. ⚠ must NOT become the rejected “needs-review” machinery.</w:t>
+        <w:t xml:space="preserve"> — light touch — don't overbuild it.</w:t>
       </w:r>
     </w:p>
     <w:p>
@@ -956,7 +916,7 @@
           <w:color w:val="B07D34"/>
           <w:sz w:val="28"/>
         </w:rPr>
-        <w:t>9 · Open decisions</w:t>
+        <w:t>9 · Decisions for you</w:t>
       </w:r>
     </w:p>
     <w:p>
@@ -976,7 +936,7 @@
           <w:color w:val="332F29"/>
           <w:sz w:val="21"/>
         </w:rPr>
-        <w:t xml:space="preserve"> — keep (baseline 84.9%) vs strip to a paid-off house (~86.5%)?</w:t>
+        <w:t xml:space="preserve"> — keep it (84.9%) or pay it off (~86.5%)?</w:t>
       </w:r>
     </w:p>
     <w:p>
@@ -989,14 +949,14 @@
           <w:color w:val="1D1913"/>
           <w:sz w:val="21"/>
         </w:rPr>
-        <w:t>Net Worth layout</w:t>
+        <w:t>Make Assets the wider column?</w:t>
       </w:r>
       <w:r>
         <w:rPr>
           <w:color w:val="332F29"/>
           <w:sz w:val="21"/>
         </w:rPr>
-        <w:t xml:space="preserve"> — make Assets the wider column (Liabilities is often sparse)?</w:t>
+        <w:t xml:space="preserve"> — Liabilities is usually sparse.</w:t>
       </w:r>
     </w:p>
     <w:p>
@@ -1009,14 +969,14 @@
           <w:color w:val="1D1913"/>
           <w:sz w:val="21"/>
         </w:rPr>
-        <w:t>SS framing</w:t>
+        <w:t>Social Security framing</w:t>
       </w:r>
       <w:r>
         <w:rPr>
           <w:color w:val="332F29"/>
           <w:sz w:val="21"/>
         </w:rPr>
-        <w:t xml:space="preserve"> — lifetime-dollars trade-off vs the % circle (weak % mover for high-spend households).</w:t>
+        <w:t xml:space="preserve"> — lifetime dollars vs the % — it barely moves the % for big spenders.</w:t>
       </w:r>
     </w:p>
     <w:p>
@@ -1036,7 +996,7 @@
           <w:color w:val="332F29"/>
           <w:sz w:val="21"/>
         </w:rPr>
-        <w:t xml:space="preserve"> — solo-vs-combined so an advisor can't misread the column %.</w:t>
+        <w:t xml:space="preserve"> — avoid the confusing one-lever-vs-all-levers %.</w:t>
       </w:r>
     </w:p>
     <w:p>
@@ -1056,7 +1016,7 @@
           <w:color w:val="332F29"/>
           <w:sz w:val="21"/>
         </w:rPr>
-        <w:t xml:space="preserve"> — base-plan input vs per-scenario construct.</w:t>
+        <w:t xml:space="preserve"> — one base plan, or per scenario?</w:t>
       </w:r>
     </w:p>
     <w:p>
@@ -1076,7 +1036,7 @@
           <w:color w:val="332F29"/>
           <w:sz w:val="21"/>
         </w:rPr>
-        <w:t xml:space="preserve"> — Sequencing feature or Scenarios feature?</w:t>
+        <w:t xml:space="preserve"> — does it live in Sequencing or Scenarios?</w:t>
       </w:r>
     </w:p>
     <w:p>
@@ -1089,7 +1049,7 @@
           <w:color w:val="B07D34"/>
           <w:sz w:val="28"/>
         </w:rPr>
-        <w:t>10 · Skip / do-not-relitigate  (logged on purpose)</w:t>
+        <w:t>10 · Decided NO — don't re-litigate</w:t>
       </w:r>
     </w:p>
     <w:p>
@@ -1102,14 +1062,14 @@
           <w:color w:val="1D1913"/>
           <w:sz w:val="21"/>
         </w:rPr>
-        <w:t>Cash-flow River / Sankey</w:t>
+        <w:t>Fancy cash-flow river diagram</w:t>
       </w:r>
       <w:r>
         <w:rPr>
           <w:color w:val="332F29"/>
           <w:sz w:val="21"/>
         </w:rPr>
-        <w:t xml:space="preserve"> — decorative, no new interaction.</w:t>
+        <w:t xml:space="preserve"> — looks nice, shows nothing new.</w:t>
       </w:r>
     </w:p>
     <w:p>
@@ -1122,14 +1082,14 @@
           <w:color w:val="1D1913"/>
           <w:sz w:val="21"/>
         </w:rPr>
-        <w:t>Resilience Matrix as a new tab</w:t>
+        <w:t>“Resilience Matrix” as a new tab</w:t>
       </w:r>
       <w:r>
         <w:rPr>
           <w:color w:val="332F29"/>
           <w:sz w:val="21"/>
         </w:rPr>
-        <w:t xml:space="preserve"> — old Stress Test reincarnated; salvage only the click-to-clone link.</w:t>
+        <w:t xml:space="preserve"> — old idea; overlaps what we already have.</w:t>
       </w:r>
     </w:p>
     <w:p>
@@ -1142,14 +1102,14 @@
           <w:color w:val="1D1913"/>
           <w:sz w:val="21"/>
         </w:rPr>
-        <w:t>Rebrand away from “Parallax”</w:t>
+        <w:t>Renaming Parallax</w:t>
       </w:r>
       <w:r>
         <w:rPr>
           <w:color w:val="332F29"/>
           <w:sz w:val="21"/>
         </w:rPr>
-        <w:t xml:space="preserve"> — business decision, not engineering.</w:t>
+        <w:t xml:space="preserve"> — a business call, not now.</w:t>
       </w:r>
     </w:p>
     <w:p>
@@ -1162,14 +1122,14 @@
           <w:color w:val="1D1913"/>
           <w:sz w:val="21"/>
         </w:rPr>
-        <w:t>Reversed-sequence view</w:t>
+        <w:t>Reverse-the-timeline view</w:t>
       </w:r>
       <w:r>
         <w:rPr>
           <w:color w:val="332F29"/>
           <w:sz w:val="21"/>
         </w:rPr>
-        <w:t xml:space="preserve"> — killed (a timeline that never happened).</w:t>
+        <w:t xml:space="preserve"> — killed — it's a story that never happened.</w:t>
       </w:r>
     </w:p>
     <w:p>
@@ -1189,7 +1149,7 @@
           <w:color w:val="332F29"/>
           <w:sz w:val="21"/>
         </w:rPr>
-        <w:t xml:space="preserve"> — re-add only with deliberate framing.</w:t>
+        <w:t xml:space="preserve"> — only with careful framing.</w:t>
       </w:r>
     </w:p>
     <w:p/>
@@ -1200,7 +1160,7 @@
           <w:color w:val="B07D34"/>
           <w:sz w:val="19"/>
         </w:rPr>
-        <w:t xml:space="preserve">Standing doctrine.  </w:t>
+        <w:t xml:space="preserve">How we work.  </w:t>
       </w:r>
       <w:r>
         <w:rPr>
@@ -1208,7 +1168,7 @@
           <w:color w:val="6B6253"/>
           <w:sz w:val="19"/>
         </w:rPr>
-        <w:t>Make requirements less dumb → delete before adding → simplify → cut beats refactor. The engine is the single truth source; the UI only changes views/levers, never the math. Green is allowed — no mint. Mock visual changes first. Verify by looking. Push to both the working branch and main.</w:t>
+        <w:t>Subtract before adding. The engine is the one source of truth — the screens only show or adjust it, never invent math. Mock big visual changes first. Check by looking, not guessing.</w:t>
       </w:r>
     </w:p>
     <w:sectPr>

</xml_diff>